<commit_message>
Clarify final report theory, research context and conclusions
</commit_message>
<xml_diff>
--- a/Final_Project/report/ELEC5305_Final_Project_Yulong_Chen.docx
+++ b/Final_Project/report/ELEC5305_Final_Project_Yulong_Chen.docx
@@ -27,7 +27,7 @@
       <w:r>
         <w:t>Yulong Chen  |  SID 550889472  |  GitHub yche0441</w:t>
         <w:br/>
-        <w:t>ELEC5305 Acoustics, Speech and Signal Processing  |  21 October 2026</w:t>
+        <w:t>ELEC5305 Acoustics, Speech and Signal Processing  |  25 October 2026</w:t>
       </w:r>
     </w:p>
     <w:p>
@@ -290,7 +290,7 @@
         <w:widowControl/>
       </w:pPr>
       <w:r>
-        <w:t>A Wiener enhancer uses a noise power spectral density (PSD) estimate in every frequency bin. An estimate measured near the start of a recording is simple and stable, but cannot track a changing background. Updating it during detected speech pauses can track changes, provided the detector admits suitable frames. Weak speech mistaken for noise can enter the estimate; a loud noise event mistaken for speech can block a needed update.</w:t>
+        <w:t>A Wiener enhancer uses a noise power spectral density (PSD) estimate in every frequency bin. Holding the initial estimate fixed is stable but cannot track later changes. Updating during detected pauses can track noise if suitable frames are admitted. An overestimated noise PSD tends to lower the estimated speech-to-noise ratio and gain, risking weak-speech suppression; an underestimate can leave more residual noise. Weak speech admitted as noise and loud noise mistaken for speech create different estimation failures.</w:t>
       </w:r>
     </w:p>
     <w:p>
@@ -322,7 +322,7 @@
         <w:widowControl/>
       </w:pPr>
       <w:r>
-        <w:t>The TSNR core derives from LIU Ming and Pascal Scalart [6] and the method of Plapous et al. [1]. The additional work consists of a controlled update-policy comparison; a common reconstruction that preserves amplitude for reference scoring; a frozen parameter-selection and reassessment procedure; and diagnostics of speech overlap and noise tracking. The controlled noise-envelope experiment then manipulates one property of the same underlying mixture to test an explanation suggested by the benchmark results.</w:t>
+        <w:t>The TSNR core derives from LIU Ming and Pascal Scalart [6] and the method of Plapous et al. [1]. The project contribution is a reproducible investigation of its noise-update policy. A common amplitude-preserving reconstruction makes the comparisons suitable for reference scoring. Section 6 selects a more protective gate using development data, then tests it on unused sentences. Sections 8 and 9 hold the speech and underlying noise fixed while imposing level changes, linking score differences to frame-level update and tracking behaviour. These experiments identify when this particular update rule helps or fails; they make no claim to a new TSNR algorithm.</w:t>
       </w:r>
     </w:p>
     <w:p>
@@ -379,7 +379,7 @@
         <w:widowControl/>
       </w:pPr>
       <w:r>
-        <w:t>Scalart and Vieira Filho [7] place a priori SNR estimation at the centre of speech enhancement. The Wiener gain depends on estimated speech and noise powers, so errors in either estimate affect suppression. Plapous et al. [1] refine the decision-directed estimate through TSNR to address its delayed response. Harmonic regeneration is a separate extension in that paper and is not implemented here. Keeping TSNR fixed makes the noise update policy an identifiable experimental change.</w:t>
+        <w:t>Scalart and Vieira Filho [7] make a priori SNR estimation central to speech enhancement: errors in estimated speech or noise power affect the Wiener gain. Plapous et al. [1] use TSNR to refine the delayed decision-directed estimate. Their harmonic-regeneration extension is not implemented here. Keeping TSNR fixed isolates the effect of the noise-update policy.</w:t>
       </w:r>
     </w:p>
     <w:p>
@@ -395,7 +395,7 @@
         <w:widowControl/>
       </w:pPr>
       <w:r>
-        <w:t>Sohn et al. [8] develop statistical voice activity detection using a likelihood-ratio decision and temporal modelling. This offers a more structured speech-presence model than a broadband energy threshold. The present detector is deliberately simpler: its threshold and hangover make the speech-protection versus update-opportunity trade-off directly inspectable. The experiment does not reproduce the Sohn detector.</w:t>
+        <w:t>Sohn et al. [8] use likelihood-ratio decisions and temporal modelling for statistical VAD. The present broadband energy gate uses less structure, but its threshold and hangover expose the trade-off between protecting speech and admitting updates. It does not reproduce the Sohn detector.</w:t>
       </w:r>
     </w:p>
     <w:p>
@@ -403,7 +403,7 @@
         <w:widowControl/>
       </w:pPr>
       <w:r>
-        <w:t>Martin [9] uses smoothed spectral minima to estimate noise without depending solely on hard speech-pause decisions. MCRA [4] regulates recursive averaging using estimated speech-presence information; improved MCRA [10] extends this approach under adverse conditions. These methods show why spectral history and uncertainty can be useful when binary decisions are unreliable.</w:t>
+        <w:t>Martin [9] tracks smoothed spectral minima; MCRA [4] and improved MCRA [10] regulate averaging using speech-presence information. Gerkmann and Hendriks [12] use a soft speech-presence probability with fixed priors, separating noise estimation from subsequent speech-power estimation. These approaches retain spectral history or uncertainty that a binary energy decision discards. They motivate a targeted follow-up: replace only the noise tracker within the shared TSNR path and test tracking and speech distortion together. Their performance is not measured here.</w:t>
       </w:r>
     </w:p>
     <w:tbl>
@@ -698,7 +698,7 @@
                 <w:b w:val="0"/>
                 <w:sz w:val="18"/>
               </w:rPr>
-              <w:t>Minima or probability based tracking [4,9,10]</w:t>
+              <w:t>Minima or probability based tracking [4,9,10,12]</w:t>
             </w:r>
           </w:p>
         </w:tc>
@@ -748,7 +748,7 @@
                 <w:b w:val="0"/>
                 <w:sz w:val="18"/>
               </w:rPr>
-              <w:t>Additional state and choices; not implemented</w:t>
+              <w:t>Additional modelling choices; untested here</w:t>
             </w:r>
           </w:p>
         </w:tc>
@@ -764,7 +764,24 @@
         <w:widowControl/>
       </w:pPr>
       <w:r>
-        <w:t>The method choice follows the project question: establish the effect of a transparent hard gate, identify its failure mechanism, then justify a more elaborate tracker if the evidence warrants it. Implementing several unrelated enhancers would confound the noise-estimation question with differences elsewhere in their processing.</w:t>
+        <w:t>The hard gate provides an inspectable first experiment: its decisions reveal when adaptation is allowed, and the matched noise-level changes test the resulting tracking behaviour. This keeps the research question focused while establishing a reason to investigate a more elaborate estimator.</w:t>
+      </w:r>
+    </w:p>
+    <w:p>
+      <w:pPr>
+        <w:pStyle w:val="Heading2"/>
+        <w:widowControl/>
+      </w:pPr>
+      <w:r>
+        <w:t>Relation to recent enhancement systems</w:t>
+      </w:r>
+    </w:p>
+    <w:p>
+      <w:pPr>
+        <w:widowControl/>
+      </w:pPr>
+      <w:r>
+        <w:t>DeepFilterNet [13] combines learned ERB-band gains for the spectral envelope with complex multi-frame filtering for speech periodicity, demonstrated on 48 kHz audio. Its learned representation and reconstruction differ from the present 8 kHz TSNR pipeline. A direct comparison would assess complete systems rather than isolate noise updating. The present study therefore provides an interpretable component investigation; it does not establish a ranking against learned models or claims about their robustness.</w:t>
       </w:r>
     </w:p>
     <w:p>
@@ -780,7 +797,7 @@
         <w:widowControl/>
       </w:pPr>
       <w:r>
-        <w:t>Hu and Loizou [2] distinguish speech distortion, background-noise distortion and overall quality in subjective evaluation. Taal et al. [3] introduce STOI as an intelligibility predictor for noisy and time-frequency processed speech. These distinctions motivate reference SNR and STOI as complementary measurements. STOI is neither a word-recognition percentage nor a listening-quality score. Waveform plots and audio examples provide context, while the conclusions remain limited to measured behaviour.</w:t>
+        <w:t>Hu and Loizou [2] distinguish speech distortion, background-noise distortion and overall quality. Taal et al. [3] introduce STOI as an intelligibility predictor for noisy and time-frequency processed speech. Reference SNR and STOI therefore provide complementary evidence; STOI is neither a word-recognition percentage nor a listening-quality score.</w:t>
       </w:r>
     </w:p>
     <w:p>
@@ -788,7 +805,7 @@
         <w:widowControl/>
       </w:pPr>
       <w:r>
-        <w:t>The literature therefore motivates three checks: a shared enhancement path to isolate the update policy; paired reference scores to distinguish waveform error from predicted intelligibility; and direct update and tracking diagnostics to investigate why a score changes. References [1-4,7-10] supply the relevant scholarly context; [5,6,11] identify the data and software actually used.</w:t>
+        <w:t>Two distinctions guide the experiment: the noise PSD describes the estimated background, whereas a priori SNR controls attenuation using that estimate; a lower waveform error need not imply higher intelligibility. Paired metrics and update traces test these different aspects. References [5,6,11] identify the data and software used.</w:t>
       </w:r>
     </w:p>
     <w:p>
@@ -813,7 +830,15 @@
         <w:widowControl/>
       </w:pPr>
       <w:r>
-        <w:t>The input is mono at 8 kHz. A 200-sample window, 80-sample hop and 400-point FFT implement 25 ms analysis and 10 ms updates. The window explicitly reproduces the source Hann convention, w[n] = 0.5 - 0.5 cos(2 pi n / 201), n = 1,...,200. No analysis setting is changed between methods.</w:t>
+        <w:t>For additive, uncorrelated speech and noise, the minimum-mean-square-error linear spectral gain is speech power divided by total power, equivalently ξ / (1 + ξ) for a priori speech-to-noise ratio ξ [7]. The implemented gains use estimated powers and additional constraints [1], so the ideal model does not guarantee minimum error on each recording.</w:t>
+      </w:r>
+    </w:p>
+    <w:p>
+      <w:pPr>
+        <w:widowControl/>
+      </w:pPr>
+      <w:r>
+        <w:t>The input is mono at 8 kHz. A 200-sample window, 80-sample hop and 400-point FFT implement 25 ms analysis and 10 ms updates. The 20 Hz FFT-bin spacing includes zero padding; the 25 ms window and its shape determine frequency resolving power. The source Hann convention is w[n] = 0.5 - 0.5 cos(2 pi n / 201), n = 1,...,200. All methods share these settings.</w:t>
       </w:r>
     </w:p>
     <w:p>
@@ -1178,7 +1203,7 @@
         <w:widowControl/>
       </w:pPr>
       <w:r>
-        <w:t>Independent peak normalisation from the source demo is removed because it would alter reference-error comparisons. All methods share the replacement reconstruction, which passes a unity-gain identity check. A separate legacy mode reproduces the source for verification. The provided licence and source headers credit the inherited TSNR implementation [6]; the controlled reconstruction and update experiments are documented adaptations.</w:t>
+        <w:t>Independent peak normalisation from the source demo is removed because it would alter reference-error comparisons. With no additional synthesis window, overlap-add is divided by the shifted analysis-window sum, not its squared sum. The unity-gain check validates amplitude and alignment, not enhancement quality. A separate legacy mode reproduces the source for verification. The licence and source headers credit the inherited TSNR implementation [6]; the common reconstruction and update experiments are documented adaptations.</w:t>
       </w:r>
     </w:p>
     <w:p>
@@ -6505,7 +6530,7 @@
         <w:widowControl/>
       </w:pPr>
       <w:r>
-        <w:t>This behaviour is compatible with the motivation for minima-based and probability-weighted tracking [4,9,10]. Their use of history or graded speech evidence addresses limitations of an instantaneous hard gate. The evidence justifies a future controlled comparison with such trackers; it does not establish their performance here. Both present modes share TSNR, so the results also do not test the benefit of its second SNR refinement [1].</w:t>
+        <w:t>The blocked updates provide a concrete connection to the motivation for minima-based and probability-weighted tracking [4,9,10,12]. Gerkmann and Hendriks [12] retain uncertainty through soft speech-presence probabilities; this suggests a controlled alternative to the binary gate. It remains necessary to test whether that estimator can recover from these upward changes without increasing speech distortion. Neither its published results nor those of DeepFilterNet [13] are directly comparable with these short 8 kHz cases. All present methods share TSNR, so this study also does not isolate the benefit of its second SNR refinement [1].</w:t>
       </w:r>
     </w:p>
     <w:p>
@@ -6521,7 +6546,7 @@
         <w:widowControl/>
       </w:pPr>
       <w:r>
-        <w:t>The original evaluation has four sentences from four speakers. The later six sentences come from known speakers, and the controlled diagnostic reuses them. The repeated conditions improve coverage of the specified manipulations without enlarging the independent speaker sample. The leave-one-out analysis is a sensitivity check, not a confidence interval. The improvement over original VAD is small and should not be translated into a claim of practically noticeable benefit.</w:t>
+        <w:t>The original evaluation has four sentences from four speakers; the later six sentences use known speakers, and the controlled diagnostic reuses them. Repeated conditions increase coverage without adding independent speakers. Leave-one-out averages check sensitivity, not population uncertainty. The small improvements over original VAD do not establish a noticeable perceptual benefit.</w:t>
       </w:r>
     </w:p>
     <w:p>
@@ -6537,7 +6562,7 @@
         <w:widowControl/>
       </w:pPr>
       <w:r>
-        <w:t>The imposed envelopes change later SNR and total noise energy as well as temporal variation. They identify responses to these particular trajectories, not the isolated effect of variability at equal average SNR. Short utterances limit settling-time observations. Standard STOI supplies predicted intelligibility; no subjective listening evaluation or manual annotation was performed. Audio examples demonstrate outputs only. The archived native scores remain separate provenance, while every main comparison now uses the same standard implementation.</w:t>
+        <w:t>The imposed envelopes change later SNR and total noise energy as well as temporal variation. The results concern these trajectories, not variability at equal average SNR. Short utterances limit settling-time observations. STOI predicts intelligibility; no subjective listening evaluation or manual annotation was performed. Audio examples demonstrate outputs only. All main comparisons use the same standard STOI implementation.</w:t>
       </w:r>
     </w:p>
     <w:p>
@@ -6553,7 +6578,7 @@
         <w:widowControl/>
       </w:pPr>
       <w:r>
-        <w:t>Energy-gated updating provides small average waveform-error improvements but does not reliably improve intelligibility predictions over fixed estimation. A development-selected protective gate improves original VAD by 0.00404 mean STOI on unused sentences while remaining slightly below fixed estimation. The matched noise experiment shows renewed tracking after a fall and blocked updates after a rise, directly connecting an imposed change to the detector's limitation. The project establishes a measured trade-off between speech protection and tracking, with reproducible counterexamples to a general advantage from adaptation.</w:t>
+        <w:t>Energy-gated updating provides small average waveform-error improvements but does not reliably improve intelligibility predictions over fixed estimation. The development-selected gate gains 0.00404 mean STOI over original VAD on unused sentences, while remaining 0.00064 below fixed estimation. For the measured mean-STOI objective, these results do not justify replacing the fixed baseline with this gate. The matched experiment shows renewed tracking after a fall and blocked updates after a rise. The contribution is a measured explanation of the speech-protection versus tracking trade-off, supported by counterexamples to a general benefit from adaptation.</w:t>
       </w:r>
     </w:p>
     <w:p>
@@ -6561,7 +6586,7 @@
         <w:widowControl/>
       </w:pPr>
       <w:r>
-        <w:t>A useful next experiment would evaluate a probability-weighted tracker on longer, independently selected recordings with prescribed changes, alongside human speech annotations. Any new parameter selection would use a separate development set and an untouched test set. The present findings support that specific extension rather than a claim that a more complex detector must always perform better.</w:t>
+        <w:t>A next experiment should replace only the tracker with a probability-weighted estimator [12], retain the shared TSNR path, and use longer recordings from independently selected speakers. A separate development set would determine parameters before an untouched test. Spectral noise-estimation error, reference SNR and STOI would test tracking and distortion; human speech annotations would check the proxy labels. A blinded listening comparison would be needed before claiming perceptual benefit. These are proposed tests, not completed outcomes or guaranteed improvements.</w:t>
       </w:r>
     </w:p>
     <w:p>
@@ -6575,276 +6600,261 @@
     </w:p>
     <w:p>
       <w:pPr>
-        <w:widowControl/>
-        <w:spacing w:after="40"/>
+        <w:spacing w:after="160" w:line="247" w:lineRule="auto"/>
       </w:pPr>
       <w:r>
         <w:rPr>
           <w:sz w:val="19"/>
         </w:rPr>
-        <w:t>[1] C. Plapous, C. Marro, and P. Scalart, “Improved signal-to-noise ratio estimation for speech enhancement,” IEEE Transactions on Audio, Speech, and Language Processing, vol. 14, no. 6, pp. 2098-2108, Nov. 2006.</w:t>
+        <w:t xml:space="preserve">[1] C. Plapous, C. Marro, and P. Scalart, “Improved signal-to-noise ratio estimation for speech enhancement,” IEEE Transactions on Audio, Speech, and Language Processing, vol. 14, no. 6, pp. 2098-2108, Nov. 2006. </w:t>
       </w:r>
-    </w:p>
-    <w:p>
-      <w:pPr>
-        <w:spacing w:after="140"/>
-      </w:pPr>
       <w:hyperlink r:id="rId16">
         <w:r>
           <w:rPr>
+            <w:sz w:val="19"/>
             <w:color w:val="155A7A"/>
           </w:rPr>
-          <w:t>Source: https://doi.org/10.1109/TASL.2006.872621</w:t>
+          <w:t>doi:10.1109/TASL.2006.872621</w:t>
         </w:r>
       </w:hyperlink>
     </w:p>
     <w:p>
       <w:pPr>
-        <w:widowControl/>
-        <w:spacing w:after="40"/>
+        <w:spacing w:after="160" w:line="247" w:lineRule="auto"/>
       </w:pPr>
       <w:r>
         <w:rPr>
           <w:sz w:val="19"/>
         </w:rPr>
-        <w:t>[2] Y. Hu and P. C. Loizou, “Subjective comparison and evaluation of speech enhancement algorithms,” Speech Communication, vol. 49, nos. 7-8, pp. 588-601, 2007.</w:t>
+        <w:t xml:space="preserve">[2] Y. Hu and P. C. Loizou, “Subjective comparison and evaluation of speech enhancement algorithms,” Speech Communication, vol. 49, nos. 7-8, pp. 588-601, 2007. </w:t>
       </w:r>
-    </w:p>
-    <w:p>
-      <w:pPr>
-        <w:spacing w:after="140"/>
-      </w:pPr>
       <w:hyperlink r:id="rId17">
         <w:r>
           <w:rPr>
+            <w:sz w:val="19"/>
             <w:color w:val="155A7A"/>
           </w:rPr>
-          <w:t>Source: https://doi.org/10.1016/j.specom.2006.12.006</w:t>
+          <w:t>doi:10.1016/j.specom.2006.12.006</w:t>
         </w:r>
       </w:hyperlink>
     </w:p>
     <w:p>
       <w:pPr>
-        <w:widowControl/>
-        <w:spacing w:after="40"/>
+        <w:spacing w:after="160" w:line="247" w:lineRule="auto"/>
       </w:pPr>
       <w:r>
         <w:rPr>
           <w:sz w:val="19"/>
         </w:rPr>
-        <w:t>[3] C. H. Taal, R. C. Hendriks, R. Heusdens, and J. Jensen, “An algorithm for intelligibility prediction of time-frequency weighted noisy speech,” IEEE Transactions on Audio, Speech, and Language Processing, vol. 19, no. 7, pp. 2125-2136, Sept. 2011.</w:t>
+        <w:t xml:space="preserve">[3] C. H. Taal, R. C. Hendriks, R. Heusdens, and J. Jensen, “An algorithm for intelligibility prediction of time-frequency weighted noisy speech,” IEEE Transactions on Audio, Speech, and Language Processing, vol. 19, no. 7, pp. 2125-2136, Sept. 2011. </w:t>
       </w:r>
-    </w:p>
-    <w:p>
-      <w:pPr>
-        <w:spacing w:after="140"/>
-      </w:pPr>
       <w:hyperlink r:id="rId18">
         <w:r>
           <w:rPr>
+            <w:sz w:val="19"/>
             <w:color w:val="155A7A"/>
           </w:rPr>
-          <w:t>Source: https://doi.org/10.1109/TASL.2011.2114881</w:t>
+          <w:t>doi:10.1109/TASL.2011.2114881</w:t>
         </w:r>
       </w:hyperlink>
     </w:p>
     <w:p>
       <w:pPr>
-        <w:widowControl/>
-        <w:spacing w:after="40"/>
+        <w:spacing w:after="160" w:line="247" w:lineRule="auto"/>
       </w:pPr>
       <w:r>
         <w:rPr>
           <w:sz w:val="19"/>
         </w:rPr>
-        <w:t>[4] I. Cohen and B. Berdugo, “Noise estimation by minima controlled recursive averaging for robust speech enhancement,” IEEE Signal Processing Letters, vol. 9, no. 1, pp. 12-15, Jan. 2002.</w:t>
+        <w:t xml:space="preserve">[4] I. Cohen and B. Berdugo, “Noise estimation by minima controlled recursive averaging for robust speech enhancement,” IEEE Signal Processing Letters, vol. 9, no. 1, pp. 12-15, Jan. 2002. </w:t>
       </w:r>
-    </w:p>
-    <w:p>
-      <w:pPr>
-        <w:spacing w:after="140"/>
-      </w:pPr>
       <w:hyperlink r:id="rId19">
         <w:r>
           <w:rPr>
+            <w:sz w:val="19"/>
             <w:color w:val="155A7A"/>
           </w:rPr>
-          <w:t>Source: https://doi.org/10.1109/97.988717</w:t>
+          <w:t>doi:10.1109/97.988717</w:t>
         </w:r>
       </w:hyperlink>
     </w:p>
     <w:p>
       <w:pPr>
-        <w:widowControl/>
-        <w:spacing w:after="40"/>
+        <w:spacing w:after="160" w:line="247" w:lineRule="auto"/>
       </w:pPr>
       <w:r>
         <w:rPr>
           <w:sz w:val="19"/>
         </w:rPr>
-        <w:t>[5] University of Texas at Dallas, “NOIZEUS: A noisy speech corpus for evaluation of speech enhancement algorithms.” Dataset description, accessed 5 October 2026.</w:t>
+        <w:t xml:space="preserve">[5] University of Texas at Dallas, “NOIZEUS: A noisy speech corpus for evaluation of speech enhancement algorithms.” Dataset description, accessed 5 October 2026. </w:t>
       </w:r>
-    </w:p>
-    <w:p>
-      <w:pPr>
-        <w:spacing w:after="140"/>
-      </w:pPr>
       <w:hyperlink r:id="rId20">
         <w:r>
           <w:rPr>
+            <w:sz w:val="19"/>
             <w:color w:val="155A7A"/>
           </w:rPr>
-          <w:t>Source: https://ecs.utdallas.edu/loizou/speech/noizeus/</w:t>
+          <w:t>Online source</w:t>
         </w:r>
       </w:hyperlink>
     </w:p>
     <w:p>
       <w:pPr>
-        <w:widowControl/>
-        <w:spacing w:after="40"/>
+        <w:spacing w:after="160" w:line="247" w:lineRule="auto"/>
       </w:pPr>
       <w:r>
         <w:rPr>
           <w:sz w:val="19"/>
         </w:rPr>
-        <w:t>[6] P. Scalart, “Wiener filter for Noise Reduction and speech enhancement,” MATLAB Central File Exchange, submission 24462. Source header credits LIU Ming (2008), with modifications by Pascal Scalart (2008 and 2020).</w:t>
+        <w:t xml:space="preserve">[6] P. Scalart, “Wiener filter for Noise Reduction and speech enhancement,” MATLAB Central File Exchange, submission 24462. Source header credits LIU Ming (2008), with modifications by Pascal Scalart (2008 and 2020). </w:t>
       </w:r>
-    </w:p>
-    <w:p>
-      <w:pPr>
-        <w:spacing w:after="140"/>
-      </w:pPr>
       <w:hyperlink r:id="rId21">
         <w:r>
           <w:rPr>
+            <w:sz w:val="19"/>
             <w:color w:val="155A7A"/>
           </w:rPr>
-          <w:t>Source: https://www.mathworks.com/matlabcentral/fileexchange/24462-wiener-filter-for-noise-reduction-and-speech-enhancement</w:t>
+          <w:t>Online source</w:t>
         </w:r>
       </w:hyperlink>
     </w:p>
     <w:p>
       <w:pPr>
-        <w:widowControl/>
-        <w:spacing w:after="40"/>
+        <w:spacing w:after="160" w:line="247" w:lineRule="auto"/>
       </w:pPr>
       <w:r>
         <w:rPr>
           <w:sz w:val="19"/>
         </w:rPr>
-        <w:t>[7] P. Scalart and J. Vieira Filho, “Speech enhancement based on a priori signal to noise estimation,” Proc. IEEE ICASSP, vol. 2, pp. 629-632, 1996.</w:t>
+        <w:t xml:space="preserve">[7] P. Scalart and J. Vieira Filho, “Speech enhancement based on a priori signal to noise estimation,” Proc. IEEE ICASSP, vol. 2, pp. 629-632, 1996. </w:t>
       </w:r>
-    </w:p>
-    <w:p>
-      <w:pPr>
-        <w:spacing w:after="140"/>
-      </w:pPr>
       <w:hyperlink r:id="rId22">
         <w:r>
           <w:rPr>
+            <w:sz w:val="19"/>
             <w:color w:val="155A7A"/>
           </w:rPr>
-          <w:t>Source: https://doi.org/10.1109/ICASSP.1996.543199</w:t>
+          <w:t>doi:10.1109/ICASSP.1996.543199</w:t>
         </w:r>
       </w:hyperlink>
     </w:p>
     <w:p>
       <w:pPr>
-        <w:widowControl/>
-        <w:spacing w:after="40"/>
+        <w:spacing w:after="160" w:line="247" w:lineRule="auto"/>
       </w:pPr>
       <w:r>
         <w:rPr>
           <w:sz w:val="19"/>
         </w:rPr>
-        <w:t>[8] J. Sohn, N. S. Kim, and W. Sung, “A statistical model-based voice activity detection,” IEEE Signal Processing Letters, vol. 6, no. 1, pp. 1-3, Jan. 1999.</w:t>
+        <w:t xml:space="preserve">[8] J. Sohn, N. S. Kim, and W. Sung, “A statistical model-based voice activity detection,” IEEE Signal Processing Letters, vol. 6, no. 1, pp. 1-3, Jan. 1999. </w:t>
       </w:r>
-    </w:p>
-    <w:p>
-      <w:pPr>
-        <w:spacing w:after="140"/>
-      </w:pPr>
       <w:hyperlink r:id="rId23">
         <w:r>
           <w:rPr>
+            <w:sz w:val="19"/>
             <w:color w:val="155A7A"/>
           </w:rPr>
-          <w:t>Source: https://doi.org/10.1109/97.736233</w:t>
+          <w:t>doi:10.1109/97.736233</w:t>
         </w:r>
       </w:hyperlink>
     </w:p>
     <w:p>
       <w:pPr>
-        <w:widowControl/>
-        <w:spacing w:after="40"/>
+        <w:spacing w:after="160" w:line="247" w:lineRule="auto"/>
       </w:pPr>
       <w:r>
         <w:rPr>
           <w:sz w:val="19"/>
         </w:rPr>
-        <w:t>[9] R. Martin, “Noise power spectral density estimation based on optimal smoothing and minimum statistics,” IEEE Transactions on Speech and Audio Processing, vol. 9, no. 5, pp. 504-512, Jul. 2001.</w:t>
+        <w:t xml:space="preserve">[9] R. Martin, “Noise power spectral density estimation based on optimal smoothing and minimum statistics,” IEEE Transactions on Speech and Audio Processing, vol. 9, no. 5, pp. 504-512, Jul. 2001. </w:t>
       </w:r>
-    </w:p>
-    <w:p>
-      <w:pPr>
-        <w:spacing w:after="140"/>
-      </w:pPr>
       <w:hyperlink r:id="rId24">
         <w:r>
           <w:rPr>
+            <w:sz w:val="19"/>
             <w:color w:val="155A7A"/>
           </w:rPr>
-          <w:t>Source: https://doi.org/10.1109/89.928915</w:t>
+          <w:t>doi:10.1109/89.928915</w:t>
         </w:r>
       </w:hyperlink>
     </w:p>
     <w:p>
       <w:pPr>
-        <w:widowControl/>
-        <w:spacing w:after="40"/>
+        <w:spacing w:after="160" w:line="247" w:lineRule="auto"/>
       </w:pPr>
       <w:r>
         <w:rPr>
           <w:sz w:val="19"/>
         </w:rPr>
-        <w:t>[10] I. Cohen, “Noise spectrum estimation in adverse environments: Improved minima controlled recursive averaging,” IEEE Transactions on Speech and Audio Processing, vol. 11, no. 5, pp. 466-475, Sept. 2003.</w:t>
+        <w:t xml:space="preserve">[10] I. Cohen, “Noise spectrum estimation in adverse environments: Improved minima controlled recursive averaging,” IEEE Transactions on Speech and Audio Processing, vol. 11, no. 5, pp. 466-475, Sept. 2003. </w:t>
       </w:r>
-    </w:p>
-    <w:p>
-      <w:pPr>
-        <w:spacing w:after="140"/>
-      </w:pPr>
       <w:hyperlink r:id="rId25">
         <w:r>
           <w:rPr>
+            <w:sz w:val="19"/>
             <w:color w:val="155A7A"/>
           </w:rPr>
-          <w:t>Source: https://doi.org/10.1109/TSA.2003.811544</w:t>
+          <w:t>doi:10.1109/TSA.2003.811544</w:t>
         </w:r>
       </w:hyperlink>
     </w:p>
     <w:p>
       <w:pPr>
-        <w:widowControl/>
-        <w:spacing w:after="40"/>
+        <w:spacing w:after="160" w:line="247" w:lineRule="auto"/>
       </w:pPr>
       <w:r>
         <w:rPr>
           <w:sz w:val="19"/>
         </w:rPr>
-        <w:t>[11] M. Pariente et al., pystoi, Python implementation of the Short Term Objective Intelligibility measure. Standard STOI, extended=False; version 0.4.1 used for the local extension.</w:t>
+        <w:t xml:space="preserve">[11] M. Pariente et al., pystoi, Python implementation of the Short Term Objective Intelligibility measure. Standard STOI, extended=False; version 0.4.1 used for the local extension. </w:t>
       </w:r>
+      <w:hyperlink r:id="rId26">
+        <w:r>
+          <w:rPr>
+            <w:sz w:val="19"/>
+            <w:color w:val="155A7A"/>
+          </w:rPr>
+          <w:t>Online source</w:t>
+        </w:r>
+      </w:hyperlink>
     </w:p>
     <w:p>
       <w:pPr>
-        <w:spacing w:after="140"/>
+        <w:spacing w:after="160" w:line="247" w:lineRule="auto"/>
       </w:pPr>
-      <w:hyperlink r:id="rId26">
+      <w:r>
+        <w:rPr>
+          <w:sz w:val="19"/>
+        </w:rPr>
+        <w:t xml:space="preserve">[12] T. Gerkmann and R. C. Hendriks, "Unbiased MMSE-Based Noise Power Estimation With Low Complexity and Low Tracking Delay," IEEE Transactions on Audio, Speech, and Language Processing, vol. 20, no. 4, pp. 1383-1393, May 2012. </w:t>
+      </w:r>
+      <w:hyperlink r:id="rId28">
         <w:r>
           <w:rPr>
+            <w:sz w:val="19"/>
             <w:color w:val="155A7A"/>
           </w:rPr>
-          <w:t>Source: https://github.com/mpariente/pystoi</w:t>
+          <w:t>doi:10.1109/TASL.2011.2180896</w:t>
+        </w:r>
+      </w:hyperlink>
+    </w:p>
+    <w:p>
+      <w:pPr>
+        <w:spacing w:after="160" w:line="247" w:lineRule="auto"/>
+      </w:pPr>
+      <w:r>
+        <w:rPr>
+          <w:sz w:val="19"/>
+        </w:rPr>
+        <w:t xml:space="preserve">[13] H. Schröter, A. N. Escalante-B., T. Rosenkranz, and A. Maier, "DeepFilterNet: Perceptually Motivated Real-Time Speech Enhancement," Proc. INTERSPEECH 2023, pp. 2008-2009, 2023. </w:t>
+      </w:r>
+      <w:hyperlink r:id="rId29">
+        <w:r>
+          <w:rPr>
+            <w:sz w:val="19"/>
+            <w:color w:val="155A7A"/>
+          </w:rPr>
+          <w:t>Online source</w:t>
         </w:r>
       </w:hyperlink>
     </w:p>

</xml_diff>